<commit_message>
docs: the QR resume is fixed and asserted; return paths share one validator
- SDD QR flow, step 3: no longer describes the WP-2.7d GuestRoute defect as
  open; records the single decider, safeInternalPath, and the forced-change
  return through workspaceReturnPath. Revision row amended.
- TESTING.md: the test.fail() section is replaced by what qr-workflow.spec.ts
  now asserts.
- SDD Word deliverable regenerated (SRS/SPMP sources unchanged, not rebuilt).

Co-Authored-By: Claude Opus 5.5 <noreply@anthropic.com>
</commit_message>
<xml_diff>
--- a/deliverables/word/Software Design Description.docx
+++ b/deliverables/word/Software Design Description.docx
@@ -4156,7 +4156,22 @@
               <w:t xml:space="preserve"> </w:t>
             </w:r>
             <w:r>
-              <w:t xml:space="preserve">is now exact (run-id-tagged audit rows; original statuses restored, only the migration’s own archives undone, later changes mapped rather than rewound). Redrew the</w:t>
+              <w:t xml:space="preserve">is now exact (run-id-tagged audit rows; original statuses restored, only the migration’s own archives undone, later changes mapped rather than rewound). Corrected the QR scan flow, step 3, which still described the WP-2.7d</w:t>
+            </w:r>
+            <w:r>
+              <w:t xml:space="preserve"> </w:t>
+            </w:r>
+            <w:r>
+              <w:rPr>
+                <w:rStyle w:val="VerbatimChar"/>
+              </w:rPr>
+              <w:t xml:space="preserve">GuestRoute</w:t>
+            </w:r>
+            <w:r>
+              <w:t xml:space="preserve"> </w:t>
+            </w:r>
+            <w:r>
+              <w:t xml:space="preserve">defect as open; it records the single-decider fix and the shared return-path validator, now also used after a forced password change. Redrew the</w:t>
             </w:r>
             <w:r>
               <w:t xml:space="preserve"> </w:t>
@@ -24166,10 +24181,7 @@
         <w:t xml:space="preserve">/app</w:t>
       </w:r>
       <w:r>
-        <w:t xml:space="preserve"> </w:t>
-      </w:r>
-      <w:r>
-        <w:t xml:space="preserve">— the current</w:t>
+        <w:t xml:space="preserve">.</w:t>
       </w:r>
       <w:r>
         <w:t xml:space="preserve"> </w:t>
@@ -24184,7 +24196,86 @@
         <w:t xml:space="preserve"> </w:t>
       </w:r>
       <w:r>
-        <w:t xml:space="preserve">does exactly that and has to learn about the pending scan.</w:t>
+        <w:t xml:space="preserve">is the single decider (</w:t>
+      </w:r>
+      <w:r>
+        <w:rPr>
+          <w:rStyle w:val="VerbatimChar"/>
+        </w:rPr>
+        <w:t xml:space="preserve">postAuthDestination</w:t>
+      </w:r>
+      <w:r>
+        <w:t xml:space="preserve">, corrected in WP-2.7d — it used to send everyone to</w:t>
+      </w:r>
+      <w:r>
+        <w:t xml:space="preserve"> </w:t>
+      </w:r>
+      <w:r>
+        <w:rPr>
+          <w:rStyle w:val="VerbatimChar"/>
+        </w:rPr>
+        <w:t xml:space="preserve">/app</w:t>
+      </w:r>
+      <w:r>
+        <w:t xml:space="preserve"> </w:t>
+      </w:r>
+      <w:r>
+        <w:t xml:space="preserve">after</w:t>
+      </w:r>
+      <w:r>
+        <w:t xml:space="preserve"> </w:t>
+      </w:r>
+      <w:r>
+        <w:rPr>
+          <w:rStyle w:val="VerbatimChar"/>
+        </w:rPr>
+        <w:t xml:space="preserve">SignInPage</w:t>
+      </w:r>
+      <w:r>
+        <w:t xml:space="preserve"> </w:t>
+      </w:r>
+      <w:r>
+        <w:t xml:space="preserve">had navigated): a pending scan outranks the remembered route, both pass</w:t>
+      </w:r>
+      <w:r>
+        <w:t xml:space="preserve"> </w:t>
+      </w:r>
+      <w:r>
+        <w:rPr>
+          <w:rStyle w:val="VerbatimChar"/>
+        </w:rPr>
+        <w:t xml:space="preserve">safeInternalPath</w:t>
+      </w:r>
+      <w:r>
+        <w:t xml:space="preserve"> </w:t>
+      </w:r>
+      <w:r>
+        <w:t xml:space="preserve">(root-relative only; protocol-relative, backslash, scheme and control-character forms refused), and no destination is ever read from the URL. A forced password change returns through the same validator, bounded to the workspace (</w:t>
+      </w:r>
+      <w:r>
+        <w:rPr>
+          <w:rStyle w:val="VerbatimChar"/>
+        </w:rPr>
+        <w:t xml:space="preserve">workspaceReturnPath</w:t>
+      </w:r>
+      <w:r>
+        <w:t xml:space="preserve">, Phase 2.11), so a scan survives sign-in</w:t>
+      </w:r>
+      <w:r>
+        <w:t xml:space="preserve"> </w:t>
+      </w:r>
+      <w:r>
+        <w:rPr>
+          <w:i/>
+          <w:iCs/>
+        </w:rPr>
+        <w:t xml:space="preserve">and</w:t>
+      </w:r>
+      <w:r>
+        <w:t xml:space="preserve"> </w:t>
+      </w:r>
+      <w:r>
+        <w:t xml:space="preserve">a forced change.</w:t>
       </w:r>
     </w:p>
     <w:p>

</xml_diff>

<commit_message>
docs: regenerate publication sources and Word deliverables
Pipeline output (docs/build_publication_sources.py, build_word_deliverables.py)
for the 2026-10-20 amendments: SDD DD-110..DD-113 and revision row, SRS
FR-NOT-006 note and revision row, SPMP revision row. The .docx files are
generated, never hand-edited (CLAUDE.md §7).

Co-Authored-By: Claude Opus 5.5 <noreply@anthropic.com>
</commit_message>
<xml_diff>
--- a/deliverables/word/Software Design Description.docx
+++ b/deliverables/word/Software Design Description.docx
@@ -4496,6 +4496,137 @@
             </w:r>
             <w:r>
               <w:t xml:space="preserve">(headline tiles moved to Overall reports, clickable workload rows and location cards, full name with middle name). DD-58…DD-67 remain the known gap and were not reused. No existing decision was removed and no version label was changed.</w:t>
+            </w:r>
+          </w:p>
+        </w:tc>
+      </w:tr>
+      <w:tr>
+        <w:trPr>
+          <w:cantSplit w:val="1"/>
+        </w:trPr>
+        <w:tc>
+          <w:tcPr>
+            <w:tcW w:w="1216" w:type="dxa"/>
+          </w:tcPr>
+          <w:p>
+            <w:pPr>
+              <w:pStyle w:val="Compact"/>
+            </w:pPr>
+            <w:r>
+              <w:t xml:space="preserve">1.0</w:t>
+            </w:r>
+          </w:p>
+        </w:tc>
+        <w:tc>
+          <w:tcPr>
+            <w:tcW w:w="1600" w:type="dxa"/>
+          </w:tcPr>
+          <w:p>
+            <w:pPr>
+              <w:pStyle w:val="Compact"/>
+            </w:pPr>
+            <w:r>
+              <w:t xml:space="preserve">2026-10-20</w:t>
+            </w:r>
+          </w:p>
+        </w:tc>
+        <w:tc>
+          <w:tcPr>
+            <w:tcW w:w="1728" w:type="dxa"/>
+          </w:tcPr>
+          <w:p>
+            <w:pPr>
+              <w:pStyle w:val="Compact"/>
+            </w:pPr>
+            <w:r>
+              <w:t xml:space="preserve">Engineering</w:t>
+            </w:r>
+          </w:p>
+        </w:tc>
+        <w:tc>
+          <w:tcPr>
+            <w:tcW w:w="4816" w:type="dxa"/>
+          </w:tcPr>
+          <w:p>
+            <w:pPr>
+              <w:pStyle w:val="Compact"/>
+            </w:pPr>
+            <w:r>
+              <w:rPr>
+                <w:b/>
+                <w:bCs/>
+              </w:rPr>
+              <w:t xml:space="preserve">Production readiness — security hardening, SMTP2GO readiness and the Render pilot</w:t>
+            </w:r>
+            <w:r>
+              <w:t xml:space="preserve"> </w:t>
+            </w:r>
+            <w:r>
+              <w:t xml:space="preserve">recorded against the Version 1.0 baseline (label unchanged). Added</w:t>
+            </w:r>
+            <w:r>
+              <w:t xml:space="preserve"> </w:t>
+            </w:r>
+            <w:r>
+              <w:rPr>
+                <w:b/>
+                <w:bCs/>
+              </w:rPr>
+              <w:t xml:space="preserve">DD-110</w:t>
+            </w:r>
+            <w:r>
+              <w:t xml:space="preserve"> </w:t>
+            </w:r>
+            <w:r>
+              <w:t xml:space="preserve">(environment-only SMTP, SMTP2GO on 2525 with STARTTLS, mail diagnostics, honest delivery states),</w:t>
+            </w:r>
+            <w:r>
+              <w:t xml:space="preserve"> </w:t>
+            </w:r>
+            <w:r>
+              <w:rPr>
+                <w:b/>
+                <w:bCs/>
+              </w:rPr>
+              <w:t xml:space="preserve">DD-111</w:t>
+            </w:r>
+            <w:r>
+              <w:t xml:space="preserve"> </w:t>
+            </w:r>
+            <w:r>
+              <w:t xml:space="preserve">(account emails queued after commit; one retry policy),</w:t>
+            </w:r>
+            <w:r>
+              <w:t xml:space="preserve"> </w:t>
+            </w:r>
+            <w:r>
+              <w:rPr>
+                <w:b/>
+                <w:bCs/>
+              </w:rPr>
+              <w:t xml:space="preserve">DD-112</w:t>
+            </w:r>
+            <w:r>
+              <w:t xml:space="preserve"> </w:t>
+            </w:r>
+            <w:r>
+              <w:t xml:space="preserve">(secret redaction, credential guards, seed-once seeders, gitleaks) and</w:t>
+            </w:r>
+            <w:r>
+              <w:t xml:space="preserve"> </w:t>
+            </w:r>
+            <w:r>
+              <w:rPr>
+                <w:b/>
+                <w:bCs/>
+              </w:rPr>
+              <w:t xml:space="preserve">DD-113</w:t>
+            </w:r>
+            <w:r>
+              <w:t xml:space="preserve"> </w:t>
+            </w:r>
+            <w:r>
+              <w:t xml:space="preserve">(host-agnostic runtime; free-tier pilot). SDD §10.3’s synchronous account email is superseded by DD-111. The digest and SLA schedules lost in the 2026-09 rebuild are restored.</w:t>
             </w:r>
           </w:p>
         </w:tc>
@@ -53340,6 +53471,871 @@
             </w:pPr>
             <w:r>
               <w:t xml:space="preserve">FR-AST-002, FR-PC-001, FR-AST-016, DD-96, DD-97</w:t>
+            </w:r>
+          </w:p>
+        </w:tc>
+      </w:tr>
+      <w:tr>
+        <w:trPr>
+          <w:cantSplit w:val="1"/>
+        </w:trPr>
+        <w:tc>
+          <w:tcPr>
+            <w:tcW w:w="1073" w:type="dxa"/>
+          </w:tcPr>
+          <w:p>
+            <w:pPr>
+              <w:pStyle w:val="Compact"/>
+            </w:pPr>
+            <w:r>
+              <w:rPr>
+                <w:b/>
+              </w:rPr>
+              <w:t xml:space="preserve">DD-110</w:t>
+            </w:r>
+          </w:p>
+        </w:tc>
+        <w:tc>
+          <w:tcPr>
+            <w:tcW w:w="2762" w:type="dxa"/>
+          </w:tcPr>
+          <w:p>
+            <w:pPr>
+              <w:pStyle w:val="Compact"/>
+            </w:pPr>
+            <w:r>
+              <w:rPr>
+                <w:b/>
+                <w:bCs/>
+              </w:rPr>
+              <w:t xml:space="preserve">Outgoing mail is environment-only SMTP; SMTP2GO on port 2525 with STARTTLS required.</w:t>
+            </w:r>
+            <w:r>
+              <w:t xml:space="preserve"> </w:t>
+            </w:r>
+            <w:r>
+              <w:rPr>
+                <w:rStyle w:val="VerbatimChar"/>
+              </w:rPr>
+              <w:t xml:space="preserve">config/mail.php</w:t>
+            </w:r>
+            <w:r>
+              <w:t xml:space="preserve"> </w:t>
+            </w:r>
+            <w:r>
+              <w:t xml:space="preserve">reads</w:t>
+            </w:r>
+            <w:r>
+              <w:t xml:space="preserve"> </w:t>
+            </w:r>
+            <w:r>
+              <w:rPr>
+                <w:rStyle w:val="VerbatimChar"/>
+              </w:rPr>
+              <w:t xml:space="preserve">MAIL_TIMEOUT</w:t>
+            </w:r>
+            <w:r>
+              <w:t xml:space="preserve"> </w:t>
+            </w:r>
+            <w:r>
+              <w:t xml:space="preserve">and</w:t>
+            </w:r>
+            <w:r>
+              <w:t xml:space="preserve"> </w:t>
+            </w:r>
+            <w:r>
+              <w:rPr>
+                <w:rStyle w:val="VerbatimChar"/>
+              </w:rPr>
+              <w:t xml:space="preserve">MAIL_REQUIRE_TLS</w:t>
+            </w:r>
+            <w:r>
+              <w:t xml:space="preserve"> </w:t>
+            </w:r>
+            <w:r>
+              <w:t xml:space="preserve">(Symfony’s</w:t>
+            </w:r>
+            <w:r>
+              <w:t xml:space="preserve"> </w:t>
+            </w:r>
+            <w:r>
+              <w:rPr>
+                <w:rStyle w:val="VerbatimChar"/>
+              </w:rPr>
+              <w:t xml:space="preserve">require_tls</w:t>
+            </w:r>
+            <w:r>
+              <w:t xml:space="preserve"> </w:t>
+            </w:r>
+            <w:r>
+              <w:t xml:space="preserve">DSN option); no provider package; local production keeps Mailpit.</w:t>
+            </w:r>
+            <w:r>
+              <w:t xml:space="preserve"> </w:t>
+            </w:r>
+            <w:r>
+              <w:rPr>
+                <w:rStyle w:val="VerbatimChar"/>
+              </w:rPr>
+              <w:t xml:space="preserve">MailDiagnostics</w:t>
+            </w:r>
+            <w:r>
+              <w:t xml:space="preserve"> </w:t>
+            </w:r>
+            <w:r>
+              <w:t xml:space="preserve">backs</w:t>
+            </w:r>
+            <w:r>
+              <w:t xml:space="preserve"> </w:t>
+            </w:r>
+            <w:r>
+              <w:rPr>
+                <w:rStyle w:val="VerbatimChar"/>
+              </w:rPr>
+              <w:t xml:space="preserve">php artisan mail:check</w:t>
+            </w:r>
+            <w:r>
+              <w:t xml:space="preserve"> </w:t>
+            </w:r>
+            <w:r>
+              <w:t xml:space="preserve">and the Administrator page</w:t>
+            </w:r>
+            <w:r>
+              <w:t xml:space="preserve"> </w:t>
+            </w:r>
+            <w:r>
+              <w:rPr>
+                <w:b/>
+                <w:bCs/>
+              </w:rPr>
+              <w:t xml:space="preserve">Outgoing email</w:t>
+            </w:r>
+            <w:r>
+              <w:t xml:space="preserve"> </w:t>
+            </w:r>
+            <w:r>
+              <w:t xml:space="preserve">(</w:t>
+            </w:r>
+            <w:r>
+              <w:rPr>
+                <w:rStyle w:val="VerbatimChar"/>
+              </w:rPr>
+              <w:t xml:space="preserve">/api/admin/system/mail</w:t>
+            </w:r>
+            <w:r>
+              <w:t xml:space="preserve">,</w:t>
+            </w:r>
+            <w:r>
+              <w:t xml:space="preserve"> </w:t>
+            </w:r>
+            <w:r>
+              <w:rPr>
+                <w:rStyle w:val="VerbatimChar"/>
+              </w:rPr>
+              <w:t xml:space="preserve">OutgoingMailPolicy</w:t>
+            </w:r>
+            <w:r>
+              <w:t xml:space="preserve">: Administrator role</w:t>
+            </w:r>
+            <w:r>
+              <w:t xml:space="preserve"> </w:t>
+            </w:r>
+            <w:r>
+              <w:rPr>
+                <w:i/>
+                <w:iCs/>
+              </w:rPr>
+              <w:t xml:space="preserve">and</w:t>
+            </w:r>
+            <w:r>
+              <w:t xml:space="preserve"> </w:t>
+            </w:r>
+            <w:r>
+              <w:rPr>
+                <w:rStyle w:val="VerbatimChar"/>
+              </w:rPr>
+              <w:t xml:space="preserve">system.settings.manage</w:t>
+            </w:r>
+            <w:r>
+              <w:t xml:space="preserve">): configuration without credentials, a connection test that sends nothing, one fixed test message to the caller only (3/h, audited).</w:t>
+            </w:r>
+            <w:r>
+              <w:t xml:space="preserve"> </w:t>
+            </w:r>
+            <w:r>
+              <w:rPr>
+                <w:rStyle w:val="VerbatimChar"/>
+              </w:rPr>
+              <w:t xml:space="preserve">MAIL_TEST_REDIRECT_TO</w:t>
+            </w:r>
+            <w:r>
+              <w:t xml:space="preserve"> </w:t>
+            </w:r>
+            <w:r>
+              <w:t xml:space="preserve">is honoured outside production only. Failures are stored as</w:t>
+            </w:r>
+            <w:r>
+              <w:t xml:space="preserve"> </w:t>
+            </w:r>
+            <w:r>
+              <w:rPr>
+                <w:rStyle w:val="VerbatimChar"/>
+              </w:rPr>
+              <w:t xml:space="preserve">MailFailure</w:t>
+            </w:r>
+            <w:r>
+              <w:t xml:space="preserve"> </w:t>
+            </w:r>
+            <w:r>
+              <w:t xml:space="preserve">names from the SMTP reply code;</w:t>
+            </w:r>
+            <w:r>
+              <w:t xml:space="preserve"> </w:t>
+            </w:r>
+            <w:r>
+              <w:rPr>
+                <w:rStyle w:val="VerbatimChar"/>
+              </w:rPr>
+              <w:t xml:space="preserve">sent</w:t>
+            </w:r>
+            <w:r>
+              <w:t xml:space="preserve"> </w:t>
+            </w:r>
+            <w:r>
+              <w:t xml:space="preserve">means accepted by the relay.</w:t>
+            </w:r>
+          </w:p>
+        </w:tc>
+        <w:tc>
+          <w:tcPr>
+            <w:tcW w:w="2762" w:type="dxa"/>
+          </w:tcPr>
+          <w:p>
+            <w:pPr>
+              <w:pStyle w:val="Compact"/>
+            </w:pPr>
+            <w:r>
+              <w:t xml:space="preserve">Render’s free web services block 25/465/587; a plain SMTP relay needs no code change between environments. Credentials must never cross the network in clear, and a redirect left set in production must never divert real users’ mail. The server’s own reply text can quote the relay username, so only a code is kept; inbox delivery is not observable by the application.</w:t>
+            </w:r>
+          </w:p>
+        </w:tc>
+        <w:tc>
+          <w:tcPr>
+            <w:tcW w:w="2763" w:type="dxa"/>
+          </w:tcPr>
+          <w:p>
+            <w:pPr>
+              <w:pStyle w:val="Compact"/>
+            </w:pPr>
+            <w:r>
+              <w:t xml:space="preserve">FR-NOT-006, FR-RPT-008, EIF-EXT-002, NFR-SEC-005</w:t>
+            </w:r>
+          </w:p>
+        </w:tc>
+      </w:tr>
+      <w:tr>
+        <w:trPr>
+          <w:cantSplit w:val="1"/>
+        </w:trPr>
+        <w:tc>
+          <w:tcPr>
+            <w:tcW w:w="1073" w:type="dxa"/>
+          </w:tcPr>
+          <w:p>
+            <w:pPr>
+              <w:pStyle w:val="Compact"/>
+            </w:pPr>
+            <w:r>
+              <w:rPr>
+                <w:b/>
+              </w:rPr>
+              <w:t xml:space="preserve">DD-111</w:t>
+            </w:r>
+          </w:p>
+        </w:tc>
+        <w:tc>
+          <w:tcPr>
+            <w:tcW w:w="2762" w:type="dxa"/>
+          </w:tcPr>
+          <w:p>
+            <w:pPr>
+              <w:pStyle w:val="Compact"/>
+            </w:pPr>
+            <w:r>
+              <w:rPr>
+                <w:b/>
+                <w:bCs/>
+              </w:rPr>
+              <w:t xml:space="preserve">Account emails are queued after commit, under one retry policy for all mail.</w:t>
+            </w:r>
+            <w:r>
+              <w:t xml:space="preserve"> </w:t>
+            </w:r>
+            <w:r>
+              <w:t xml:space="preserve">Registration submitted/approved/rejected and</w:t>
+            </w:r>
+            <w:r>
+              <w:t xml:space="preserve"> </w:t>
+            </w:r>
+            <w:r>
+              <w:rPr>
+                <w:rStyle w:val="VerbatimChar"/>
+              </w:rPr>
+              <w:t xml:space="preserve">AdminMessage</w:t>
+            </w:r>
+            <w:r>
+              <w:t xml:space="preserve"> </w:t>
+            </w:r>
+            <w:r>
+              <w:t xml:space="preserve">extend</w:t>
+            </w:r>
+            <w:r>
+              <w:t xml:space="preserve"> </w:t>
+            </w:r>
+            <w:r>
+              <w:rPr>
+                <w:rStyle w:val="VerbatimChar"/>
+              </w:rPr>
+              <w:t xml:space="preserve">AccountMail</w:t>
+            </w:r>
+            <w:r>
+              <w:t xml:space="preserve"> </w:t>
+            </w:r>
+            <w:r>
+              <w:t xml:space="preserve">(</w:t>
+            </w:r>
+            <w:r>
+              <w:rPr>
+                <w:rStyle w:val="VerbatimChar"/>
+              </w:rPr>
+              <w:t xml:space="preserve">ShouldQueueAfterCommit</w:t>
+            </w:r>
+            <w:r>
+              <w:t xml:space="preserve">,</w:t>
+            </w:r>
+            <w:r>
+              <w:t xml:space="preserve"> </w:t>
+            </w:r>
+            <w:r>
+              <w:rPr>
+                <w:rStyle w:val="VerbatimChar"/>
+              </w:rPr>
+              <w:t xml:space="preserve">notifications</w:t>
+            </w:r>
+            <w:r>
+              <w:t xml:space="preserve"> </w:t>
+            </w:r>
+            <w:r>
+              <w:t xml:space="preserve">queue); the password reset is</w:t>
+            </w:r>
+            <w:r>
+              <w:t xml:space="preserve"> </w:t>
+            </w:r>
+            <w:r>
+              <w:rPr>
+                <w:rStyle w:val="VerbatimChar"/>
+              </w:rPr>
+              <w:t xml:space="preserve">QueuedResetPassword</w:t>
+            </w:r>
+            <w:r>
+              <w:t xml:space="preserve">.</w:t>
+            </w:r>
+            <w:r>
+              <w:t xml:space="preserve"> </w:t>
+            </w:r>
+            <w:r>
+              <w:rPr>
+                <w:rStyle w:val="VerbatimChar"/>
+              </w:rPr>
+              <w:t xml:space="preserve">RetriesMailDelivery</w:t>
+            </w:r>
+            <w:r>
+              <w:t xml:space="preserve"> </w:t>
+            </w:r>
+            <w:r>
+              <w:t xml:space="preserve">(3 tries; 60/300/900 s) also covers</w:t>
+            </w:r>
+            <w:r>
+              <w:t xml:space="preserve"> </w:t>
+            </w:r>
+            <w:r>
+              <w:rPr>
+                <w:rStyle w:val="VerbatimChar"/>
+              </w:rPr>
+              <w:t xml:space="preserve">ProjectNotification</w:t>
+            </w:r>
+            <w:r>
+              <w:t xml:space="preserve"> </w:t>
+            </w:r>
+            <w:r>
+              <w:t xml:space="preserve">and</w:t>
+            </w:r>
+            <w:r>
+              <w:t xml:space="preserve"> </w:t>
+            </w:r>
+            <w:r>
+              <w:rPr>
+                <w:rStyle w:val="VerbatimChar"/>
+              </w:rPr>
+              <w:t xml:space="preserve">ReportEmailNotification</w:t>
+            </w:r>
+            <w:r>
+              <w:t xml:space="preserve">. The database queue’s</w:t>
+            </w:r>
+            <w:r>
+              <w:t xml:space="preserve"> </w:t>
+            </w:r>
+            <w:r>
+              <w:rPr>
+                <w:rStyle w:val="VerbatimChar"/>
+              </w:rPr>
+              <w:t xml:space="preserve">retry_after</w:t>
+            </w:r>
+            <w:r>
+              <w:t xml:space="preserve"> </w:t>
+            </w:r>
+            <w:r>
+              <w:t xml:space="preserve">is 240 s. Supersedes §10.3’s synchronous sending.</w:t>
+            </w:r>
+          </w:p>
+        </w:tc>
+        <w:tc>
+          <w:tcPr>
+            <w:tcW w:w="2762" w:type="dxa"/>
+          </w:tcPr>
+          <w:p>
+            <w:pPr>
+              <w:pStyle w:val="Compact"/>
+            </w:pPr>
+            <w:r>
+              <w:t xml:space="preserve">With a real relay, synchronous sending turned an outage into a 500 after the database change had committed, and a bulk message could leave a transaction that then rolled back. Relay deferrals clear in minutes, not the worker’s 5 s. A</w:t>
+            </w:r>
+            <w:r>
+              <w:t xml:space="preserve"> </w:t>
+            </w:r>
+            <w:r>
+              <w:rPr>
+                <w:rStyle w:val="VerbatimChar"/>
+              </w:rPr>
+              <w:t xml:space="preserve">retry_after</w:t>
+            </w:r>
+            <w:r>
+              <w:t xml:space="preserve"> </w:t>
+            </w:r>
+            <w:r>
+              <w:t xml:space="preserve">shorter than the longest job (180 s) would hand a running job to a second worker.</w:t>
+            </w:r>
+          </w:p>
+        </w:tc>
+        <w:tc>
+          <w:tcPr>
+            <w:tcW w:w="2763" w:type="dxa"/>
+          </w:tcPr>
+          <w:p>
+            <w:pPr>
+              <w:pStyle w:val="Compact"/>
+            </w:pPr>
+            <w:r>
+              <w:t xml:space="preserve">FR-AUTH-013/015, FR-NOT-006, NFR-AVL-*</w:t>
+            </w:r>
+          </w:p>
+        </w:tc>
+      </w:tr>
+      <w:tr>
+        <w:trPr>
+          <w:cantSplit w:val="1"/>
+        </w:trPr>
+        <w:tc>
+          <w:tcPr>
+            <w:tcW w:w="1073" w:type="dxa"/>
+          </w:tcPr>
+          <w:p>
+            <w:pPr>
+              <w:pStyle w:val="Compact"/>
+            </w:pPr>
+            <w:r>
+              <w:rPr>
+                <w:b/>
+              </w:rPr>
+              <w:t xml:space="preserve">DD-112</w:t>
+            </w:r>
+          </w:p>
+        </w:tc>
+        <w:tc>
+          <w:tcPr>
+            <w:tcW w:w="2762" w:type="dxa"/>
+          </w:tcPr>
+          <w:p>
+            <w:pPr>
+              <w:pStyle w:val="Compact"/>
+            </w:pPr>
+            <w:r>
+              <w:rPr>
+                <w:b/>
+                <w:bCs/>
+              </w:rPr>
+              <w:t xml:space="preserve">Secrets never reach logs, failed jobs or a public response.</w:t>
+            </w:r>
+            <w:r>
+              <w:t xml:space="preserve"> </w:t>
+            </w:r>
+            <w:r>
+              <w:rPr>
+                <w:rStyle w:val="VerbatimChar"/>
+              </w:rPr>
+              <w:t xml:space="preserve">ConfiguredSecrets</w:t>
+            </w:r>
+            <w:r>
+              <w:t xml:space="preserve"> </w:t>
+            </w:r>
+            <w:r>
+              <w:t xml:space="preserve">lists this deployment’s credential values;</w:t>
+            </w:r>
+            <w:r>
+              <w:t xml:space="preserve"> </w:t>
+            </w:r>
+            <w:r>
+              <w:rPr>
+                <w:rStyle w:val="VerbatimChar"/>
+              </w:rPr>
+              <w:t xml:space="preserve">RedactSecretsProcessor</w:t>
+            </w:r>
+            <w:r>
+              <w:t xml:space="preserve"> </w:t>
+            </w:r>
+            <w:r>
+              <w:t xml:space="preserve">runs on every file/stream log channel;</w:t>
+            </w:r>
+            <w:r>
+              <w:t xml:space="preserve"> </w:t>
+            </w:r>
+            <w:r>
+              <w:rPr>
+                <w:rStyle w:val="VerbatimChar"/>
+              </w:rPr>
+              <w:t xml:space="preserve">RedactingFailedJobProvider</w:t>
+            </w:r>
+            <w:r>
+              <w:t xml:space="preserve"> </w:t>
+            </w:r>
+            <w:r>
+              <w:t xml:space="preserve">decorates the failed-job store;</w:t>
+            </w:r>
+            <w:r>
+              <w:t xml:space="preserve"> </w:t>
+            </w:r>
+            <w:r>
+              <w:rPr>
+                <w:rStyle w:val="VerbatimChar"/>
+              </w:rPr>
+              <w:t xml:space="preserve">zend.exception_ignore_args = On</w:t>
+            </w:r>
+            <w:r>
+              <w:t xml:space="preserve">;</w:t>
+            </w:r>
+            <w:r>
+              <w:t xml:space="preserve"> </w:t>
+            </w:r>
+            <w:r>
+              <w:rPr>
+                <w:rStyle w:val="VerbatimChar"/>
+              </w:rPr>
+              <w:t xml:space="preserve">/api/health</w:t>
+            </w:r>
+            <w:r>
+              <w:t xml:space="preserve"> </w:t>
+            </w:r>
+            <w:r>
+              <w:t xml:space="preserve">reports</w:t>
+            </w:r>
+            <w:r>
+              <w:t xml:space="preserve"> </w:t>
+            </w:r>
+            <w:r>
+              <w:rPr>
+                <w:rStyle w:val="VerbatimChar"/>
+              </w:rPr>
+              <w:t xml:space="preserve">ok</w:t>
+            </w:r>
+            <w:r>
+              <w:t xml:space="preserve">/</w:t>
+            </w:r>
+            <w:r>
+              <w:rPr>
+                <w:rStyle w:val="VerbatimChar"/>
+              </w:rPr>
+              <w:t xml:space="preserve">error</w:t>
+            </w:r>
+            <w:r>
+              <w:t xml:space="preserve">/</w:t>
+            </w:r>
+            <w:r>
+              <w:rPr>
+                <w:rStyle w:val="VerbatimChar"/>
+              </w:rPr>
+              <w:t xml:space="preserve">not_used</w:t>
+            </w:r>
+            <w:r>
+              <w:t xml:space="preserve"> </w:t>
+            </w:r>
+            <w:r>
+              <w:t xml:space="preserve">only.</w:t>
+            </w:r>
+            <w:r>
+              <w:t xml:space="preserve"> </w:t>
+            </w:r>
+            <w:r>
+              <w:rPr>
+                <w:rStyle w:val="VerbatimChar"/>
+              </w:rPr>
+              <w:t xml:space="preserve">compose.prod.yaml</w:t>
+            </w:r>
+            <w:r>
+              <w:t xml:space="preserve"> </w:t>
+            </w:r>
+            <w:r>
+              <w:t xml:space="preserve">has no password fallbacks,</w:t>
+            </w:r>
+            <w:r>
+              <w:t xml:space="preserve"> </w:t>
+            </w:r>
+            <w:r>
+              <w:rPr>
+                <w:rStyle w:val="VerbatimChar"/>
+              </w:rPr>
+              <w:t xml:space="preserve">deploy-prod.sh</w:t>
+            </w:r>
+            <w:r>
+              <w:t xml:space="preserve"> </w:t>
+            </w:r>
+            <w:r>
+              <w:t xml:space="preserve">refuses weak or published passwords and commits not on</w:t>
+            </w:r>
+            <w:r>
+              <w:t xml:space="preserve"> </w:t>
+            </w:r>
+            <w:r>
+              <w:rPr>
+                <w:rStyle w:val="VerbatimChar"/>
+              </w:rPr>
+              <w:t xml:space="preserve">origin/main</w:t>
+            </w:r>
+            <w:r>
+              <w:t xml:space="preserve">,</w:t>
+            </w:r>
+            <w:r>
+              <w:t xml:space="preserve"> </w:t>
+            </w:r>
+            <w:r>
+              <w:rPr>
+                <w:rStyle w:val="VerbatimChar"/>
+              </w:rPr>
+              <w:t xml:space="preserve">rotate-prod-credentials.sh</w:t>
+            </w:r>
+            <w:r>
+              <w:t xml:space="preserve"> </w:t>
+            </w:r>
+            <w:r>
+              <w:t xml:space="preserve">rotates them; seeders never overwrite existing administrators, settings or AI models; CI runs gitleaks.</w:t>
+            </w:r>
+          </w:p>
+        </w:tc>
+        <w:tc>
+          <w:tcPr>
+            <w:tcW w:w="2762" w:type="dxa"/>
+          </w:tcPr>
+          <w:p>
+            <w:pPr>
+              <w:pStyle w:val="Compact"/>
+            </w:pPr>
+            <w:r>
+              <w:t xml:space="preserve">The repository is public and production ran on the documented development passwords. Symfony’s SMTP authentication failure embeds the relay username, stack-trace arguments carried the start of the base64 password, and the health route returned the database host and user to anyone. A re-run</w:t>
+            </w:r>
+            <w:r>
+              <w:t xml:space="preserve"> </w:t>
+            </w:r>
+            <w:r>
+              <w:rPr>
+                <w:rStyle w:val="VerbatimChar"/>
+              </w:rPr>
+              <w:t xml:space="preserve">db:seed --force</w:t>
+            </w:r>
+            <w:r>
+              <w:t xml:space="preserve"> </w:t>
+            </w:r>
+            <w:r>
+              <w:t xml:space="preserve">reset the administrator’s password.</w:t>
+            </w:r>
+          </w:p>
+        </w:tc>
+        <w:tc>
+          <w:tcPr>
+            <w:tcW w:w="2763" w:type="dxa"/>
+          </w:tcPr>
+          <w:p>
+            <w:pPr>
+              <w:pStyle w:val="Compact"/>
+            </w:pPr>
+            <w:r>
+              <w:t xml:space="preserve">NFR-SEC-005, NFR-SEC-006, FR-CFG-004</w:t>
+            </w:r>
+          </w:p>
+        </w:tc>
+      </w:tr>
+      <w:tr>
+        <w:trPr>
+          <w:cantSplit w:val="1"/>
+        </w:trPr>
+        <w:tc>
+          <w:tcPr>
+            <w:tcW w:w="1073" w:type="dxa"/>
+          </w:tcPr>
+          <w:p>
+            <w:pPr>
+              <w:pStyle w:val="Compact"/>
+            </w:pPr>
+            <w:r>
+              <w:rPr>
+                <w:b/>
+              </w:rPr>
+              <w:t xml:space="preserve">DD-113</w:t>
+            </w:r>
+          </w:p>
+        </w:tc>
+        <w:tc>
+          <w:tcPr>
+            <w:tcW w:w="2762" w:type="dxa"/>
+          </w:tcPr>
+          <w:p>
+            <w:pPr>
+              <w:pStyle w:val="Compact"/>
+            </w:pPr>
+            <w:r>
+              <w:rPr>
+                <w:b/>
+                <w:bCs/>
+              </w:rPr>
+              <w:t xml:space="preserve">Host-agnostic runtime, and a free-tier Render pilot with synthetic data.</w:t>
+            </w:r>
+            <w:r>
+              <w:t xml:space="preserve"> </w:t>
+            </w:r>
+            <w:r>
+              <w:rPr>
+                <w:rStyle w:val="VerbatimChar"/>
+              </w:rPr>
+              <w:t xml:space="preserve">TRUST_PROXIES</w:t>
+            </w:r>
+            <w:r>
+              <w:t xml:space="preserve">,</w:t>
+            </w:r>
+            <w:r>
+              <w:t xml:space="preserve"> </w:t>
+            </w:r>
+            <w:r>
+              <w:rPr>
+                <w:rStyle w:val="VerbatimChar"/>
+              </w:rPr>
+              <w:t xml:space="preserve">filesystems.attachments</w:t>
+            </w:r>
+            <w:r>
+              <w:t xml:space="preserve"> </w:t>
+            </w:r>
+            <w:r>
+              <w:t xml:space="preserve">(</w:t>
+            </w:r>
+            <w:r>
+              <w:rPr>
+                <w:rStyle w:val="VerbatimChar"/>
+              </w:rPr>
+              <w:t xml:space="preserve">ATTACHMENTS_DISK</w:t>
+            </w:r>
+            <w:r>
+              <w:t xml:space="preserve">; each row keeps its own disk), an import reader that copies from object storage to a temporary file, QR codes encoded from the current</w:t>
+            </w:r>
+            <w:r>
+              <w:t xml:space="preserve"> </w:t>
+            </w:r>
+            <w:r>
+              <w:rPr>
+                <w:rStyle w:val="VerbatimChar"/>
+              </w:rPr>
+              <w:t xml:space="preserve">FRONTEND_URL</w:t>
+            </w:r>
+            <w:r>
+              <w:t xml:space="preserve">. The pilot runs nginx, PHP-FPM, Reverb, a database-queue worker and the scheduler in one container (</w:t>
+            </w:r>
+            <w:r>
+              <w:rPr>
+                <w:rStyle w:val="VerbatimChar"/>
+              </w:rPr>
+              <w:t xml:space="preserve">docker/render/</w:t>
+            </w:r>
+            <w:r>
+              <w:t xml:space="preserve">), keeps Postgres and files outside it, deploys only through an approved workflow pinned to a commit on</w:t>
+            </w:r>
+            <w:r>
+              <w:t xml:space="preserve"> </w:t>
+            </w:r>
+            <w:r>
+              <w:rPr>
+                <w:rStyle w:val="VerbatimChar"/>
+              </w:rPr>
+              <w:t xml:space="preserve">main</w:t>
+            </w:r>
+            <w:r>
+              <w:t xml:space="preserve">, and is backed up nightly, age-encrypted, to a private store (docs/RENDER_PILOT.md).</w:t>
+            </w:r>
+          </w:p>
+        </w:tc>
+        <w:tc>
+          <w:tcPr>
+            <w:tcW w:w="2762" w:type="dxa"/>
+          </w:tcPr>
+          <w:p>
+            <w:pPr>
+              <w:pStyle w:val="Compact"/>
+            </w:pPr>
+            <w:r>
+              <w:t xml:space="preserve">Free web services cannot receive private-network traffic, have no workers, cron, shell or durable disk, and</w:t>
+            </w:r>
+            <w:r>
+              <w:t xml:space="preserve"> </w:t>
+            </w:r>
+            <w:r>
+              <w:rPr>
+                <w:rStyle w:val="VerbatimChar"/>
+              </w:rPr>
+              <w:t xml:space="preserve">onrender.com</w:t>
+            </w:r>
+            <w:r>
+              <w:t xml:space="preserve"> </w:t>
+            </w:r>
+            <w:r>
+              <w:t xml:space="preserve">is on the Public Suffix List, so the SPA and API must share one origin. Render’s own guidance excludes production use; local production stays authoritative.</w:t>
+            </w:r>
+          </w:p>
+        </w:tc>
+        <w:tc>
+          <w:tcPr>
+            <w:tcW w:w="2763" w:type="dxa"/>
+          </w:tcPr>
+          <w:p>
+            <w:pPr>
+              <w:pStyle w:val="Compact"/>
+            </w:pPr>
+            <w:r>
+              <w:t xml:space="preserve">NFR-PERF-</w:t>
+            </w:r>
+            <w:r>
+              <w:rPr>
+                <w:i/>
+                <w:iCs/>
+              </w:rPr>
+              <w:t xml:space="preserve">, NFR-AVL-</w:t>
+            </w:r>
+            <w:r>
+              <w:t xml:space="preserve">, NFR-SEC-*, CON-10</w:t>
             </w:r>
           </w:p>
         </w:tc>

</xml_diff>